<commit_message>
final file is updated
</commit_message>
<xml_diff>
--- a/final file.docx
+++ b/final file.docx
@@ -21,6 +21,12 @@
           <w:lang w:val="en-US"/>
         </w:rPr>
       </w:pPr>
+      <w:r>
+        <w:rPr>
+          <w:lang w:val="en-US"/>
+        </w:rPr>
+        <w:t>This is the new file.</w:t>
+      </w:r>
     </w:p>
     <w:sectPr>
       <w:pgSz w:w="11906" w:h="16838"/>

</xml_diff>